<commit_message>
feat: add range and batch editing tools
Agent-Logs-Url: https://github.com/Union-Work-Place/extended-docx-mcp/sessions/4f35c25a-00c8-4206-9385-c86747b12837

Co-authored-by: hospitaler17 <32496338+hospitaler17@users.noreply.github.com>
</commit_message>
<xml_diff>
--- a/tests/fixtures/with_review.docx
+++ b/tests/fixtures/with_review.docx
@@ -27,7 +27,7 @@
       </w:r>
     </w:p>
     <w:p>
-      <w:ins w:id="3" w:author="QA" w:date="2026-05-16T13:52:27.535062+00:00">
+      <w:ins w:id="3" w:author="QA" w:date="2026-05-16T13:54:17.629062+00:00">
         <w:r>
           <w:t>Inserted review note.</w:t>
         </w:r>
@@ -37,12 +37,12 @@
       <w:r>
         <w:t xml:space="preserve">The </w:t>
       </w:r>
-      <w:del w:id="1" w:author="QA" w:date="2026-05-16T13:52:27.520565+00:00">
+      <w:del w:id="1" w:author="QA" w:date="2026-05-16T13:54:17.614490+00:00">
         <w:r>
           <w:delText>draft</w:delText>
         </w:r>
       </w:del>
-      <w:ins w:id="2" w:author="QA" w:date="2026-05-16T13:52:27.520565+00:00">
+      <w:ins w:id="2" w:author="QA" w:date="2026-05-16T13:54:17.614490+00:00">
         <w:r>
           <w:t>approved</w:t>
         </w:r>
@@ -144,7 +144,7 @@
 
 <file path=word/comments.xml><?xml version="1.0" encoding="utf-8"?>
 <w:comments xmlns:w="http://schemas.openxmlformats.org/wordprocessingml/2006/main">
-  <w:comment w:id="0" w:author="Editor" w:initials="ED" w:date="2026-05-16T13:52:27.528357+00:00">
+  <w:comment w:id="0" w:author="Editor" w:initials="ED" w:date="2026-05-16T13:54:17.622357+00:00">
     <w:p>
       <w:r>
         <w:t>Confirm the source for this budget.</w:t>

</xml_diff>

<commit_message>
chore: address validation feedback
Agent-Logs-Url: https://github.com/Union-Work-Place/extended-docx-mcp/sessions/4f35c25a-00c8-4206-9385-c86747b12837

Co-authored-by: hospitaler17 <32496338+hospitaler17@users.noreply.github.com>
</commit_message>
<xml_diff>
--- a/tests/fixtures/with_review.docx
+++ b/tests/fixtures/with_review.docx
@@ -27,7 +27,7 @@
       </w:r>
     </w:p>
     <w:p>
-      <w:ins w:id="3" w:author="QA" w:date="2026-05-16T13:54:17.629062+00:00">
+      <w:ins w:id="3" w:author="QA" w:date="2026-05-16T13:55:12.268410+00:00">
         <w:r>
           <w:t>Inserted review note.</w:t>
         </w:r>
@@ -37,12 +37,12 @@
       <w:r>
         <w:t xml:space="preserve">The </w:t>
       </w:r>
-      <w:del w:id="1" w:author="QA" w:date="2026-05-16T13:54:17.614490+00:00">
+      <w:del w:id="1" w:author="QA" w:date="2026-05-16T13:55:12.253865+00:00">
         <w:r>
           <w:delText>draft</w:delText>
         </w:r>
       </w:del>
-      <w:ins w:id="2" w:author="QA" w:date="2026-05-16T13:54:17.614490+00:00">
+      <w:ins w:id="2" w:author="QA" w:date="2026-05-16T13:55:12.253865+00:00">
         <w:r>
           <w:t>approved</w:t>
         </w:r>
@@ -144,7 +144,7 @@
 
 <file path=word/comments.xml><?xml version="1.0" encoding="utf-8"?>
 <w:comments xmlns:w="http://schemas.openxmlformats.org/wordprocessingml/2006/main">
-  <w:comment w:id="0" w:author="Editor" w:initials="ED" w:date="2026-05-16T13:54:17.622357+00:00">
+  <w:comment w:id="0" w:author="Editor" w:initials="ED" w:date="2026-05-16T13:55:12.261770+00:00">
     <w:p>
       <w:r>
         <w:t>Confirm the source for this budget.</w:t>

</xml_diff>

<commit_message>
chore: align response suggestions with codebase language
Agent-Logs-Url: https://github.com/Union-Work-Place/extended-docx-mcp/sessions/4f35c25a-00c8-4206-9385-c86747b12837

Co-authored-by: hospitaler17 <32496338+hospitaler17@users.noreply.github.com>
</commit_message>
<xml_diff>
--- a/tests/fixtures/with_review.docx
+++ b/tests/fixtures/with_review.docx
@@ -27,7 +27,7 @@
       </w:r>
     </w:p>
     <w:p>
-      <w:ins w:id="3" w:author="QA" w:date="2026-05-16T13:55:12.268410+00:00">
+      <w:ins w:id="3" w:author="QA" w:date="2026-05-16T13:56:01.428466+00:00">
         <w:r>
           <w:t>Inserted review note.</w:t>
         </w:r>
@@ -37,12 +37,12 @@
       <w:r>
         <w:t xml:space="preserve">The </w:t>
       </w:r>
-      <w:del w:id="1" w:author="QA" w:date="2026-05-16T13:55:12.253865+00:00">
+      <w:del w:id="1" w:author="QA" w:date="2026-05-16T13:56:01.413816+00:00">
         <w:r>
           <w:delText>draft</w:delText>
         </w:r>
       </w:del>
-      <w:ins w:id="2" w:author="QA" w:date="2026-05-16T13:55:12.253865+00:00">
+      <w:ins w:id="2" w:author="QA" w:date="2026-05-16T13:56:01.413816+00:00">
         <w:r>
           <w:t>approved</w:t>
         </w:r>
@@ -144,7 +144,7 @@
 
 <file path=word/comments.xml><?xml version="1.0" encoding="utf-8"?>
 <w:comments xmlns:w="http://schemas.openxmlformats.org/wordprocessingml/2006/main">
-  <w:comment w:id="0" w:author="Editor" w:initials="ED" w:date="2026-05-16T13:55:12.261770+00:00">
+  <w:comment w:id="0" w:author="Editor" w:initials="ED" w:date="2026-05-16T13:56:01.421694+00:00">
     <w:p>
       <w:r>
         <w:t>Confirm the source for this budget.</w:t>

</xml_diff>

<commit_message>
chore: clean up review follow-ups
Agent-Logs-Url: https://github.com/Union-Work-Place/extended-docx-mcp/sessions/4f35c25a-00c8-4206-9385-c86747b12837

Co-authored-by: hospitaler17 <32496338+hospitaler17@users.noreply.github.com>
</commit_message>
<xml_diff>
--- a/tests/fixtures/with_review.docx
+++ b/tests/fixtures/with_review.docx
@@ -27,7 +27,7 @@
       </w:r>
     </w:p>
     <w:p>
-      <w:ins w:id="3" w:author="QA" w:date="2026-05-16T13:56:01.428466+00:00">
+      <w:ins w:id="3" w:author="QA" w:date="2026-05-16T13:57:00.588824+00:00">
         <w:r>
           <w:t>Inserted review note.</w:t>
         </w:r>
@@ -37,12 +37,12 @@
       <w:r>
         <w:t xml:space="preserve">The </w:t>
       </w:r>
-      <w:del w:id="1" w:author="QA" w:date="2026-05-16T13:56:01.413816+00:00">
+      <w:del w:id="1" w:author="QA" w:date="2026-05-16T13:57:00.574174+00:00">
         <w:r>
           <w:delText>draft</w:delText>
         </w:r>
       </w:del>
-      <w:ins w:id="2" w:author="QA" w:date="2026-05-16T13:56:01.413816+00:00">
+      <w:ins w:id="2" w:author="QA" w:date="2026-05-16T13:57:00.574174+00:00">
         <w:r>
           <w:t>approved</w:t>
         </w:r>
@@ -144,7 +144,7 @@
 
 <file path=word/comments.xml><?xml version="1.0" encoding="utf-8"?>
 <w:comments xmlns:w="http://schemas.openxmlformats.org/wordprocessingml/2006/main">
-  <w:comment w:id="0" w:author="Editor" w:initials="ED" w:date="2026-05-16T13:56:01.421694+00:00">
+  <w:comment w:id="0" w:author="Editor" w:initials="ED" w:date="2026-05-16T13:57:00.582062+00:00">
     <w:p>
       <w:r>
         <w:t>Confirm the source for this budget.</w:t>

</xml_diff>

<commit_message>
chore: finish validation cleanup
Agent-Logs-Url: https://github.com/Union-Work-Place/extended-docx-mcp/sessions/4f35c25a-00c8-4206-9385-c86747b12837

Co-authored-by: hospitaler17 <32496338+hospitaler17@users.noreply.github.com>
</commit_message>
<xml_diff>
--- a/tests/fixtures/with_review.docx
+++ b/tests/fixtures/with_review.docx
@@ -27,7 +27,7 @@
       </w:r>
     </w:p>
     <w:p>
-      <w:ins w:id="3" w:author="QA" w:date="2026-05-16T13:57:00.588824+00:00">
+      <w:ins w:id="3" w:author="QA" w:date="2026-05-16T13:58:08.595239+00:00">
         <w:r>
           <w:t>Inserted review note.</w:t>
         </w:r>
@@ -37,12 +37,12 @@
       <w:r>
         <w:t xml:space="preserve">The </w:t>
       </w:r>
-      <w:del w:id="1" w:author="QA" w:date="2026-05-16T13:57:00.574174+00:00">
+      <w:del w:id="1" w:author="QA" w:date="2026-05-16T13:58:08.580620+00:00">
         <w:r>
           <w:delText>draft</w:delText>
         </w:r>
       </w:del>
-      <w:ins w:id="2" w:author="QA" w:date="2026-05-16T13:57:00.574174+00:00">
+      <w:ins w:id="2" w:author="QA" w:date="2026-05-16T13:58:08.580620+00:00">
         <w:r>
           <w:t>approved</w:t>
         </w:r>
@@ -144,7 +144,7 @@
 
 <file path=word/comments.xml><?xml version="1.0" encoding="utf-8"?>
 <w:comments xmlns:w="http://schemas.openxmlformats.org/wordprocessingml/2006/main">
-  <w:comment w:id="0" w:author="Editor" w:initials="ED" w:date="2026-05-16T13:57:00.582062+00:00">
+  <w:comment w:id="0" w:author="Editor" w:initials="ED" w:date="2026-05-16T13:58:08.588543+00:00">
     <w:p>
       <w:r>
         <w:t>Confirm the source for this budget.</w:t>

</xml_diff>

<commit_message>
chore: fix pytest import ordering
Agent-Logs-Url: https://github.com/Union-Work-Place/extended-docx-mcp/sessions/4f35c25a-00c8-4206-9385-c86747b12837

Co-authored-by: hospitaler17 <32496338+hospitaler17@users.noreply.github.com>
</commit_message>
<xml_diff>
--- a/tests/fixtures/with_review.docx
+++ b/tests/fixtures/with_review.docx
@@ -27,7 +27,7 @@
       </w:r>
     </w:p>
     <w:p>
-      <w:ins w:id="3" w:author="QA" w:date="2026-05-16T13:58:08.595239+00:00">
+      <w:ins w:id="3" w:author="QA" w:date="2026-05-16T13:59:05.625819+00:00">
         <w:r>
           <w:t>Inserted review note.</w:t>
         </w:r>
@@ -37,12 +37,12 @@
       <w:r>
         <w:t xml:space="preserve">The </w:t>
       </w:r>
-      <w:del w:id="1" w:author="QA" w:date="2026-05-16T13:58:08.580620+00:00">
+      <w:del w:id="1" w:author="QA" w:date="2026-05-16T13:59:05.611094+00:00">
         <w:r>
           <w:delText>draft</w:delText>
         </w:r>
       </w:del>
-      <w:ins w:id="2" w:author="QA" w:date="2026-05-16T13:58:08.580620+00:00">
+      <w:ins w:id="2" w:author="QA" w:date="2026-05-16T13:59:05.611094+00:00">
         <w:r>
           <w:t>approved</w:t>
         </w:r>
@@ -144,7 +144,7 @@
 
 <file path=word/comments.xml><?xml version="1.0" encoding="utf-8"?>
 <w:comments xmlns:w="http://schemas.openxmlformats.org/wordprocessingml/2006/main">
-  <w:comment w:id="0" w:author="Editor" w:initials="ED" w:date="2026-05-16T13:58:08.588543+00:00">
+  <w:comment w:id="0" w:author="Editor" w:initials="ED" w:date="2026-05-16T13:59:05.619127+00:00">
     <w:p>
       <w:r>
         <w:t>Confirm the source for this budget.</w:t>

</xml_diff>

<commit_message>
Fix crashes on fractional section margins and unify paragraph indexing; add regression tests (#4)
* Fixed issues from `docs/plan.md`

* Potential fix for pull request finding

Co-authored-by: Copilot Autofix powered by AI <175728472+Copilot@users.noreply.github.com>

---------

Co-authored-by: Copilot Autofix powered by AI <175728472+Copilot@users.noreply.github.com>
</commit_message>
<xml_diff>
--- a/tests/fixtures/with_review.docx
+++ b/tests/fixtures/with_review.docx
@@ -27,7 +27,7 @@
       </w:r>
     </w:p>
     <w:p>
-      <w:ins w:id="3" w:author="QA" w:date="2026-05-16T13:59:05.625819+00:00">
+      <w:ins w:id="3" w:author="QA" w:date="2026-05-17T12:13:22.981641+00:00">
         <w:r>
           <w:t>Inserted review note.</w:t>
         </w:r>
@@ -37,12 +37,12 @@
       <w:r>
         <w:t xml:space="preserve">The </w:t>
       </w:r>
-      <w:del w:id="1" w:author="QA" w:date="2026-05-16T13:59:05.611094+00:00">
+      <w:del w:id="1" w:author="QA" w:date="2026-05-17T12:13:22.957608+00:00">
         <w:r>
           <w:delText>draft</w:delText>
         </w:r>
       </w:del>
-      <w:ins w:id="2" w:author="QA" w:date="2026-05-16T13:59:05.611094+00:00">
+      <w:ins w:id="2" w:author="QA" w:date="2026-05-17T12:13:22.957608+00:00">
         <w:r>
           <w:t>approved</w:t>
         </w:r>
@@ -144,7 +144,7 @@
 
 <file path=word/comments.xml><?xml version="1.0" encoding="utf-8"?>
 <w:comments xmlns:w="http://schemas.openxmlformats.org/wordprocessingml/2006/main">
-  <w:comment w:id="0" w:author="Editor" w:initials="ED" w:date="2026-05-16T13:59:05.619127+00:00">
+  <w:comment w:id="0" w:author="Editor" w:initials="ED" w:date="2026-05-17T12:13:22.970350+00:00">
     <w:p>
       <w:r>
         <w:t>Confirm the source for this budget.</w:t>

</xml_diff>